<commit_message>
Add a real per-page chakra watermark to the docx itself
Previously the background motifs only existed on the website; the
ebook file had none, which is what "no background, chakra or chariot
in each page" was about. Added a faint chakra image anchored in the
header (behind text, centered on the page), the same mechanism Word's
own Insert > Watermark feature uses, so it repeats automatically on
every page when the docx is opened.

build/scripts/add-header-watermark.py is the one-time script that
baked this into reference.docx; it's documented in build/README.md
along with two honest caveats: I can't visually verify this in the
current sandbox (LibreOffice's headless PDF conversion is broken here,
unrelated to this file), and it's untested whether the watermark
survives KDP's Kindle conversion, since reflowable Kindle format has
no fixed page and often strips header content.
</commit_message>
<xml_diff>
--- a/build/reference.docx
+++ b/build/reference.docx
@@ -382,7 +382,9 @@
 </w:t>
       </w:r>
     </w:p>
-    <w:sectPr/>
+    <w:sectPr>
+      <w:headerReference w:type="default" r:id="rId9"/>
+    </w:sectPr>
   </w:body>
 </w:document>
 </file>
@@ -427,6 +429,60 @@
     </w:p>
   </w:footnote>
 </w:footnotes>
+</file>
+
+<file path=word/header1.xml><?xml version="1.0" encoding="utf-8"?>
+<w:hdr xmlns:m="http://schemas.openxmlformats.org/officeDocument/2006/math" xmlns:mc="http://schemas.openxmlformats.org/markup-compatibility/2006" xmlns:mo="http://schemas.microsoft.com/office/mac/office/2008/main" xmlns:mv="urn:schemas-microsoft-com:mac:vml" xmlns:o="urn:schemas-microsoft-com:office:office" xmlns:r="http://schemas.openxmlformats.org/officeDocument/2006/relationships" xmlns:v="urn:schemas-microsoft-com:vml" xmlns:w10="urn:schemas-microsoft-com:office:word" xmlns:w14="http://schemas.microsoft.com/office/word/2010/wordml" xmlns:w="http://schemas.openxmlformats.org/wordprocessingml/2006/main" xmlns:wne="http://schemas.microsoft.com/office/word/2006/wordml" xmlns:wp14="http://schemas.microsoft.com/office/word/2010/wordprocessingDrawing" xmlns:wp="http://schemas.openxmlformats.org/drawingml/2006/wordprocessingDrawing" xmlns:wpc="http://schemas.microsoft.com/office/word/2010/wordprocessingCanvas" xmlns:wpg="http://schemas.microsoft.com/office/word/2010/wordprocessingGroup" xmlns:wpi="http://schemas.microsoft.com/office/word/2010/wordprocessingInk" xmlns:wps="http://schemas.microsoft.com/office/word/2010/wordprocessingShape" mc:Ignorable="w14 wp14">
+  <w:p>
+    <w:pPr>
+      <w:pStyle w:val="Header"/>
+    </w:pPr>
+  </w:p>
+  <w:p>
+    <w:r>
+      <w:drawing>
+        <wp:anchor distT="0" distB="0" distL="0" distR="0" simplePos="0" relativeHeight="1" behindDoc="1" locked="0" layoutInCell="1" allowOverlap="1">
+          <wp:simplePos x="0" y="0"/>
+          <wp:positionH relativeFrom="page">
+            <wp:align>center</wp:align>
+          </wp:positionH>
+          <wp:positionV relativeFrom="page">
+            <wp:align>center</wp:align>
+          </wp:positionV>
+          <wp:extent cx="3840480" cy="3840480"/>
+          <wp:wrapNone/>
+          <wp:docPr id="1001" name="Watermark"/>
+          <wp:cNvGraphicFramePr/>
+          <a:graphic xmlns:a="http://schemas.openxmlformats.org/drawingml/2006/main">
+            <a:graphicData uri="http://schemas.openxmlformats.org/drawingml/2006/picture">
+              <pic:pic xmlns:pic="http://schemas.openxmlformats.org/drawingml/2006/picture">
+                <pic:nvPicPr>
+                  <pic:cNvPr id="0" name="watermark-chakra.png"/>
+                  <pic:cNvPicPr/>
+                </pic:nvPicPr>
+                <pic:blipFill>
+                  <a:blip r:embed="rId1"/>
+                  <a:stretch>
+                    <a:fillRect/>
+                  </a:stretch>
+                </pic:blipFill>
+                <pic:spPr>
+                  <a:xfrm>
+                    <a:off x="0" y="0"/>
+                    <a:ext cx="3840480" cy="3840480"/>
+                  </a:xfrm>
+                  <a:prstGeom prst="rect">
+                    <a:avLst/>
+                  </a:prstGeom>
+                </pic:spPr>
+              </pic:pic>
+            </a:graphicData>
+          </a:graphic>
+        </wp:anchor>
+      </w:drawing>
+    </w:r>
+  </w:p>
+</w:hdr>
 </file>
 
 <file path=word/numbering.xml><?xml version="1.0" encoding="utf-8"?>

</xml_diff>

<commit_message>
Replace chakra-only watermark with a multi-symbol composite
Feedback was that only the chakra showed, wanted the chariot wheel and
other symbols too. Composited chakra (centered, dominant), chariot
wheel, peacock feather, lotus, and shankha into one watermark image
(assets/illustrations/motifs/page-watermark.png) at matching low
opacity, and re-anchored it in reference.docx's header at the correct
portrait aspect ratio instead of a square crop.

Also split the docx customization into two reproducible scripts run in
order against a clean pandoc reference.docx (style-reference-docx.py
for fonts/pagination/shading, then add-header-watermark.py for the
watermark), since editing an already-customized reference.docx in
place risked stacking duplicate watermarks. Documented the regen
sequence in build/README.md.
</commit_message>
<xml_diff>
--- a/build/reference.docx
+++ b/build/reference.docx
@@ -449,7 +449,7 @@
           <wp:positionV relativeFrom="page">
             <wp:align>center</wp:align>
           </wp:positionV>
-          <wp:extent cx="3840480" cy="3840480"/>
+          <wp:extent cx="5486400" cy="7053942"/>
           <wp:wrapNone/>
           <wp:docPr id="1001" name="Watermark"/>
           <wp:cNvGraphicFramePr/>
@@ -457,7 +457,7 @@
             <a:graphicData uri="http://schemas.openxmlformats.org/drawingml/2006/picture">
               <pic:pic xmlns:pic="http://schemas.openxmlformats.org/drawingml/2006/picture">
                 <pic:nvPicPr>
-                  <pic:cNvPr id="0" name="watermark-chakra.png"/>
+                  <pic:cNvPr id="0" name="page-watermark.png"/>
                   <pic:cNvPicPr/>
                 </pic:nvPicPr>
                 <pic:blipFill>
@@ -469,7 +469,7 @@
                 <pic:spPr>
                   <a:xfrm>
                     <a:off x="0" y="0"/>
-                    <a:ext cx="3840480" cy="3840480"/>
+                    <a:ext cx="5486400" cy="7053942"/>
                   </a:xfrm>
                   <a:prstGeom prst="rect">
                     <a:avLst/>

</xml_diff>

<commit_message>
Strip all decorative background/motifs, go plain white + real illustrations only
Reversing the parchment-and-symbols direction per direct feedback:
removed the page-margin motifs (peacock feather, chakra, lotus,
shankha, chariot wheel) from the website, removed the docx header
watermark (regenerated reference.docx from clean pandoc default and
reapplied only fonts/pagination/shloka-shading, skipping the
watermark script), and switched both the site and epub base palette
from warm parchment to plain white / near-black text.

Kept the shloka verse quote's shaded highlight box as-is (tan
background, not full-page decoration) since that was a distinct,
separately-requested feature -- flagging this choice to confirm
rather than silently removing it too.
</commit_message>
<xml_diff>
--- a/build/reference.docx
+++ b/build/reference.docx
@@ -382,9 +382,7 @@
 </w:t>
       </w:r>
     </w:p>
-    <w:sectPr>
-      <w:headerReference w:type="default" r:id="rId9"/>
-    </w:sectPr>
+    <w:sectPr/>
   </w:body>
 </w:document>
 </file>
@@ -429,60 +427,6 @@
     </w:p>
   </w:footnote>
 </w:footnotes>
-</file>
-
-<file path=word/header1.xml><?xml version="1.0" encoding="utf-8"?>
-<w:hdr xmlns:m="http://schemas.openxmlformats.org/officeDocument/2006/math" xmlns:mc="http://schemas.openxmlformats.org/markup-compatibility/2006" xmlns:mo="http://schemas.microsoft.com/office/mac/office/2008/main" xmlns:mv="urn:schemas-microsoft-com:mac:vml" xmlns:o="urn:schemas-microsoft-com:office:office" xmlns:r="http://schemas.openxmlformats.org/officeDocument/2006/relationships" xmlns:v="urn:schemas-microsoft-com:vml" xmlns:w10="urn:schemas-microsoft-com:office:word" xmlns:w14="http://schemas.microsoft.com/office/word/2010/wordml" xmlns:w="http://schemas.openxmlformats.org/wordprocessingml/2006/main" xmlns:wne="http://schemas.microsoft.com/office/word/2006/wordml" xmlns:wp14="http://schemas.microsoft.com/office/word/2010/wordprocessingDrawing" xmlns:wp="http://schemas.openxmlformats.org/drawingml/2006/wordprocessingDrawing" xmlns:wpc="http://schemas.microsoft.com/office/word/2010/wordprocessingCanvas" xmlns:wpg="http://schemas.microsoft.com/office/word/2010/wordprocessingGroup" xmlns:wpi="http://schemas.microsoft.com/office/word/2010/wordprocessingInk" xmlns:wps="http://schemas.microsoft.com/office/word/2010/wordprocessingShape" mc:Ignorable="w14 wp14">
-  <w:p>
-    <w:pPr>
-      <w:pStyle w:val="Header"/>
-    </w:pPr>
-  </w:p>
-  <w:p>
-    <w:r>
-      <w:drawing>
-        <wp:anchor distT="0" distB="0" distL="0" distR="0" simplePos="0" relativeHeight="1" behindDoc="1" locked="0" layoutInCell="1" allowOverlap="1">
-          <wp:simplePos x="0" y="0"/>
-          <wp:positionH relativeFrom="page">
-            <wp:align>center</wp:align>
-          </wp:positionH>
-          <wp:positionV relativeFrom="page">
-            <wp:align>center</wp:align>
-          </wp:positionV>
-          <wp:extent cx="5486400" cy="7053942"/>
-          <wp:wrapNone/>
-          <wp:docPr id="1001" name="Watermark"/>
-          <wp:cNvGraphicFramePr/>
-          <a:graphic xmlns:a="http://schemas.openxmlformats.org/drawingml/2006/main">
-            <a:graphicData uri="http://schemas.openxmlformats.org/drawingml/2006/picture">
-              <pic:pic xmlns:pic="http://schemas.openxmlformats.org/drawingml/2006/picture">
-                <pic:nvPicPr>
-                  <pic:cNvPr id="0" name="page-watermark.png"/>
-                  <pic:cNvPicPr/>
-                </pic:nvPicPr>
-                <pic:blipFill>
-                  <a:blip r:embed="rId1"/>
-                  <a:stretch>
-                    <a:fillRect/>
-                  </a:stretch>
-                </pic:blipFill>
-                <pic:spPr>
-                  <a:xfrm>
-                    <a:off x="0" y="0"/>
-                    <a:ext cx="5486400" cy="7053942"/>
-                  </a:xfrm>
-                  <a:prstGeom prst="rect">
-                    <a:avLst/>
-                  </a:prstGeom>
-                </pic:spPr>
-              </pic:pic>
-            </a:graphicData>
-          </a:graphic>
-        </wp:anchor>
-      </w:drawing>
-    </w:r>
-  </w:p>
-</w:hdr>
 </file>
 
 <file path=word/numbering.xml><?xml version="1.0" encoding="utf-8"?>

</xml_diff>